<commit_message>
docs(E1.1): Documento preenchido e assinado
</commit_message>
<xml_diff>
--- a/documentos/ciclo-1/E1.1_Termo_de_Constituicao_de_Equipe.docx
+++ b/documentos/ciclo-1/E1.1_Termo_de_Constituicao_de_Equipe.docx
@@ -9115,41 +9115,13 @@
                 </w:tcPr>
                 <w:p>
                   <w:pPr>
-                    <w:keepNext w:val="0"/>
-                    <w:keepLines w:val="0"/>
-                    <w:pageBreakBefore w:val="0"/>
-                    <w:widowControl w:val="1"/>
-                    <w:pBdr>
-                      <w:top w:space="0" w:sz="0" w:val="nil"/>
-                      <w:left w:space="0" w:sz="0" w:val="nil"/>
-                      <w:bottom w:space="0" w:sz="0" w:val="nil"/>
-                      <w:right w:space="0" w:sz="0" w:val="nil"/>
-                      <w:between w:space="0" w:sz="0" w:val="nil"/>
-                    </w:pBdr>
-                    <w:shd w:fill="auto" w:val="clear"/>
-                    <w:spacing w:after="0" w:before="0" w:line="240" w:lineRule="auto"/>
-                    <w:ind w:left="0" w:right="0" w:firstLine="0"/>
-                    <w:jc w:val="left"/>
-                    <w:rPr>
-                      <w:rFonts w:ascii="Arial Narrow" w:cs="Arial Narrow" w:eastAsia="Arial Narrow" w:hAnsi="Arial Narrow"/>
-                      <w:b w:val="0"/>
-                      <w:bCs w:val="0"/>
-                      <w:i w:val="0"/>
-                      <w:iCs w:val="0"/>
-                      <w:smallCaps w:val="0"/>
-                      <w:strike w:val="0"/>
-                      <w:color w:val="000000"/>
-                      <w:sz w:val="20"/>
-                      <w:szCs w:val="20"/>
-                      <w:u w:val="none"/>
-                      <w:shd w:fill="auto" w:val="clear"/>
-                      <w:vertAlign w:val="baseline"/>
-                    </w:rPr>
-                  </w:pPr>
-                  <w:r>
-                    <w:rPr>
-                      <w:rtl w:val="0"/>
-                    </w:rPr>
+                    <w:rPr/>
+                  </w:pPr>
+                  <w:r>
+                    <w:rPr>
+                      <w:rtl w:val="0"/>
+                    </w:rPr>
+                    <w:t xml:space="preserve">-sirca-equipe-D/documentos/ciclo-1/ </w:t>
                   </w:r>
                 </w:p>
               </w:tc>
@@ -9211,41 +9183,13 @@
                 </w:tcPr>
                 <w:p>
                   <w:pPr>
-                    <w:keepNext w:val="0"/>
-                    <w:keepLines w:val="0"/>
-                    <w:pageBreakBefore w:val="0"/>
-                    <w:widowControl w:val="1"/>
-                    <w:pBdr>
-                      <w:top w:space="0" w:sz="0" w:val="nil"/>
-                      <w:left w:space="0" w:sz="0" w:val="nil"/>
-                      <w:bottom w:space="0" w:sz="0" w:val="nil"/>
-                      <w:right w:space="0" w:sz="0" w:val="nil"/>
-                      <w:between w:space="0" w:sz="0" w:val="nil"/>
-                    </w:pBdr>
-                    <w:shd w:fill="auto" w:val="clear"/>
-                    <w:spacing w:after="0" w:before="0" w:line="240" w:lineRule="auto"/>
-                    <w:ind w:left="0" w:right="0" w:firstLine="0"/>
-                    <w:jc w:val="left"/>
-                    <w:rPr>
-                      <w:rFonts w:ascii="Arial Narrow" w:cs="Arial Narrow" w:eastAsia="Arial Narrow" w:hAnsi="Arial Narrow"/>
-                      <w:b w:val="0"/>
-                      <w:bCs w:val="0"/>
-                      <w:i w:val="0"/>
-                      <w:iCs w:val="0"/>
-                      <w:smallCaps w:val="0"/>
-                      <w:strike w:val="0"/>
-                      <w:color w:val="000000"/>
-                      <w:sz w:val="20"/>
-                      <w:szCs w:val="20"/>
-                      <w:u w:val="none"/>
-                      <w:shd w:fill="auto" w:val="clear"/>
-                      <w:vertAlign w:val="baseline"/>
-                    </w:rPr>
-                  </w:pPr>
-                  <w:r>
-                    <w:rPr>
-                      <w:rtl w:val="0"/>
-                    </w:rPr>
+                    <w:rPr/>
+                  </w:pPr>
+                  <w:r>
+                    <w:rPr>
+                      <w:rtl w:val="0"/>
+                    </w:rPr>
+                    <w:t xml:space="preserve">-sirca-equipe-D/documentos/ciclo-1/ </w:t>
                   </w:r>
                 </w:p>
               </w:tc>
@@ -9309,41 +9253,13 @@
                 </w:tcPr>
                 <w:p>
                   <w:pPr>
-                    <w:keepNext w:val="0"/>
-                    <w:keepLines w:val="0"/>
-                    <w:pageBreakBefore w:val="0"/>
-                    <w:widowControl w:val="1"/>
-                    <w:pBdr>
-                      <w:top w:space="0" w:sz="0" w:val="nil"/>
-                      <w:left w:space="0" w:sz="0" w:val="nil"/>
-                      <w:bottom w:space="0" w:sz="0" w:val="nil"/>
-                      <w:right w:space="0" w:sz="0" w:val="nil"/>
-                      <w:between w:space="0" w:sz="0" w:val="nil"/>
-                    </w:pBdr>
-                    <w:shd w:fill="auto" w:val="clear"/>
-                    <w:spacing w:after="0" w:before="0" w:line="240" w:lineRule="auto"/>
-                    <w:ind w:left="0" w:right="0" w:firstLine="0"/>
-                    <w:jc w:val="left"/>
-                    <w:rPr>
-                      <w:rFonts w:ascii="Arial Narrow" w:cs="Arial Narrow" w:eastAsia="Arial Narrow" w:hAnsi="Arial Narrow"/>
-                      <w:b w:val="0"/>
-                      <w:bCs w:val="0"/>
-                      <w:i w:val="0"/>
-                      <w:iCs w:val="0"/>
-                      <w:smallCaps w:val="0"/>
-                      <w:strike w:val="0"/>
-                      <w:color w:val="000000"/>
-                      <w:sz w:val="20"/>
-                      <w:szCs w:val="20"/>
-                      <w:u w:val="none"/>
-                      <w:shd w:fill="auto" w:val="clear"/>
-                      <w:vertAlign w:val="baseline"/>
-                    </w:rPr>
-                  </w:pPr>
-                  <w:r>
-                    <w:rPr>
-                      <w:rtl w:val="0"/>
-                    </w:rPr>
+                    <w:rPr/>
+                  </w:pPr>
+                  <w:r>
+                    <w:rPr>
+                      <w:rtl w:val="0"/>
+                    </w:rPr>
+                    <w:t xml:space="preserve">-sirca-equipe-D/documentos/ciclo-1/ </w:t>
                   </w:r>
                 </w:p>
               </w:tc>
@@ -9405,405 +9321,13 @@
                 </w:tcPr>
                 <w:p>
                   <w:pPr>
-                    <w:keepNext w:val="0"/>
-                    <w:keepLines w:val="0"/>
-                    <w:pageBreakBefore w:val="0"/>
-                    <w:widowControl w:val="1"/>
-                    <w:pBdr>
-                      <w:top w:space="0" w:sz="0" w:val="nil"/>
-                      <w:left w:space="0" w:sz="0" w:val="nil"/>
-                      <w:bottom w:space="0" w:sz="0" w:val="nil"/>
-                      <w:right w:space="0" w:sz="0" w:val="nil"/>
-                      <w:between w:space="0" w:sz="0" w:val="nil"/>
-                    </w:pBdr>
-                    <w:shd w:fill="auto" w:val="clear"/>
-                    <w:spacing w:after="0" w:before="0" w:line="240" w:lineRule="auto"/>
-                    <w:ind w:left="0" w:right="0" w:firstLine="0"/>
-                    <w:jc w:val="left"/>
-                    <w:rPr>
-                      <w:rFonts w:ascii="Arial Narrow" w:cs="Arial Narrow" w:eastAsia="Arial Narrow" w:hAnsi="Arial Narrow"/>
-                      <w:b w:val="0"/>
-                      <w:bCs w:val="0"/>
-                      <w:i w:val="0"/>
-                      <w:iCs w:val="0"/>
-                      <w:smallCaps w:val="0"/>
-                      <w:strike w:val="0"/>
-                      <w:color w:val="000000"/>
-                      <w:sz w:val="20"/>
-                      <w:szCs w:val="20"/>
-                      <w:u w:val="none"/>
-                      <w:shd w:fill="auto" w:val="clear"/>
-                      <w:vertAlign w:val="baseline"/>
-                    </w:rPr>
-                  </w:pPr>
-                  <w:r>
-                    <w:rPr>
-                      <w:rtl w:val="0"/>
-                    </w:rPr>
-                  </w:r>
-                </w:p>
-              </w:tc>
-            </w:tr>
-            <w:tr>
-              <w:trPr>
-                <w:cantSplit w:val="0"/>
-                <w:tblHeader w:val="0"/>
-              </w:trPr>
-              <w:tc>
-                <w:tcPr>
-                  <w:vAlign w:val="center"/>
-                </w:tcPr>
-                <w:p>
-                  <w:pPr>
-                    <w:keepNext w:val="0"/>
-                    <w:keepLines w:val="0"/>
-                    <w:pageBreakBefore w:val="0"/>
-                    <w:widowControl w:val="1"/>
-                    <w:pBdr>
-                      <w:top w:space="0" w:sz="0" w:val="nil"/>
-                      <w:left w:space="0" w:sz="0" w:val="nil"/>
-                      <w:bottom w:space="0" w:sz="0" w:val="nil"/>
-                      <w:right w:space="0" w:sz="0" w:val="nil"/>
-                      <w:between w:space="0" w:sz="0" w:val="nil"/>
-                    </w:pBdr>
-                    <w:shd w:fill="auto" w:val="clear"/>
-                    <w:spacing w:after="0" w:before="0" w:line="240" w:lineRule="auto"/>
-                    <w:ind w:left="0" w:right="0" w:firstLine="0"/>
-                    <w:jc w:val="left"/>
-                    <w:rPr>
-                      <w:rFonts w:ascii="Arial Narrow" w:cs="Arial Narrow" w:eastAsia="Arial Narrow" w:hAnsi="Arial Narrow"/>
-                      <w:b w:val="0"/>
-                      <w:bCs w:val="0"/>
-                      <w:i w:val="0"/>
-                      <w:iCs w:val="0"/>
-                      <w:smallCaps w:val="0"/>
-                      <w:strike w:val="0"/>
-                      <w:color w:val="000000"/>
-                      <w:sz w:val="20"/>
-                      <w:szCs w:val="20"/>
-                      <w:u w:val="none"/>
-                      <w:shd w:fill="auto" w:val="clear"/>
-                      <w:vertAlign w:val="baseline"/>
-                    </w:rPr>
-                  </w:pPr>
-                  <w:r>
-                    <w:rPr>
-                      <w:rtl w:val="0"/>
-                    </w:rPr>
-                  </w:r>
-                </w:p>
-              </w:tc>
-              <w:tc>
-                <w:tcPr>
-                  <w:vAlign w:val="center"/>
-                </w:tcPr>
-                <w:p>
-                  <w:pPr>
-                    <w:keepNext w:val="0"/>
-                    <w:keepLines w:val="0"/>
-                    <w:pageBreakBefore w:val="0"/>
-                    <w:widowControl w:val="1"/>
-                    <w:pBdr>
-                      <w:top w:space="0" w:sz="0" w:val="nil"/>
-                      <w:left w:space="0" w:sz="0" w:val="nil"/>
-                      <w:bottom w:space="0" w:sz="0" w:val="nil"/>
-                      <w:right w:space="0" w:sz="0" w:val="nil"/>
-                      <w:between w:space="0" w:sz="0" w:val="nil"/>
-                    </w:pBdr>
-                    <w:shd w:fill="auto" w:val="clear"/>
-                    <w:spacing w:after="0" w:before="0" w:line="240" w:lineRule="auto"/>
-                    <w:ind w:left="0" w:right="0" w:firstLine="0"/>
-                    <w:jc w:val="left"/>
-                    <w:rPr>
-                      <w:rFonts w:ascii="Arial Narrow" w:cs="Arial Narrow" w:eastAsia="Arial Narrow" w:hAnsi="Arial Narrow"/>
-                      <w:b w:val="0"/>
-                      <w:bCs w:val="0"/>
-                      <w:i w:val="0"/>
-                      <w:iCs w:val="0"/>
-                      <w:smallCaps w:val="0"/>
-                      <w:strike w:val="0"/>
-                      <w:color w:val="000000"/>
-                      <w:sz w:val="20"/>
-                      <w:szCs w:val="20"/>
-                      <w:u w:val="none"/>
-                      <w:shd w:fill="auto" w:val="clear"/>
-                      <w:vertAlign w:val="baseline"/>
-                    </w:rPr>
-                  </w:pPr>
-                  <w:r>
-                    <w:rPr>
-                      <w:rtl w:val="0"/>
-                    </w:rPr>
-                  </w:r>
-                </w:p>
-              </w:tc>
-              <w:tc>
-                <w:tcPr>
-                  <w:vAlign w:val="center"/>
-                </w:tcPr>
-                <w:p>
-                  <w:pPr>
-                    <w:keepNext w:val="0"/>
-                    <w:keepLines w:val="0"/>
-                    <w:pageBreakBefore w:val="0"/>
-                    <w:widowControl w:val="1"/>
-                    <w:pBdr>
-                      <w:top w:space="0" w:sz="0" w:val="nil"/>
-                      <w:left w:space="0" w:sz="0" w:val="nil"/>
-                      <w:bottom w:space="0" w:sz="0" w:val="nil"/>
-                      <w:right w:space="0" w:sz="0" w:val="nil"/>
-                      <w:between w:space="0" w:sz="0" w:val="nil"/>
-                    </w:pBdr>
-                    <w:shd w:fill="auto" w:val="clear"/>
-                    <w:spacing w:after="0" w:before="0" w:line="240" w:lineRule="auto"/>
-                    <w:ind w:left="0" w:right="0" w:firstLine="0"/>
-                    <w:jc w:val="left"/>
-                    <w:rPr>
-                      <w:rFonts w:ascii="Arial Narrow" w:cs="Arial Narrow" w:eastAsia="Arial Narrow" w:hAnsi="Arial Narrow"/>
-                      <w:b w:val="0"/>
-                      <w:bCs w:val="0"/>
-                      <w:i w:val="0"/>
-                      <w:iCs w:val="0"/>
-                      <w:smallCaps w:val="0"/>
-                      <w:strike w:val="0"/>
-                      <w:color w:val="000000"/>
-                      <w:sz w:val="20"/>
-                      <w:szCs w:val="20"/>
-                      <w:u w:val="none"/>
-                      <w:shd w:fill="auto" w:val="clear"/>
-                      <w:vertAlign w:val="baseline"/>
-                    </w:rPr>
-                  </w:pPr>
-                  <w:r>
-                    <w:rPr>
-                      <w:rtl w:val="0"/>
-                    </w:rPr>
-                  </w:r>
-                </w:p>
-              </w:tc>
-              <w:tc>
-                <w:tcPr>
-                  <w:vAlign w:val="center"/>
-                </w:tcPr>
-                <w:p>
-                  <w:pPr>
-                    <w:keepNext w:val="0"/>
-                    <w:keepLines w:val="0"/>
-                    <w:pageBreakBefore w:val="0"/>
-                    <w:widowControl w:val="1"/>
-                    <w:pBdr>
-                      <w:top w:space="0" w:sz="0" w:val="nil"/>
-                      <w:left w:space="0" w:sz="0" w:val="nil"/>
-                      <w:bottom w:space="0" w:sz="0" w:val="nil"/>
-                      <w:right w:space="0" w:sz="0" w:val="nil"/>
-                      <w:between w:space="0" w:sz="0" w:val="nil"/>
-                    </w:pBdr>
-                    <w:shd w:fill="auto" w:val="clear"/>
-                    <w:spacing w:after="0" w:before="0" w:line="240" w:lineRule="auto"/>
-                    <w:ind w:left="0" w:right="0" w:firstLine="0"/>
-                    <w:jc w:val="left"/>
-                    <w:rPr>
-                      <w:rFonts w:ascii="Arial Narrow" w:cs="Arial Narrow" w:eastAsia="Arial Narrow" w:hAnsi="Arial Narrow"/>
-                      <w:b w:val="0"/>
-                      <w:bCs w:val="0"/>
-                      <w:i w:val="0"/>
-                      <w:iCs w:val="0"/>
-                      <w:smallCaps w:val="0"/>
-                      <w:strike w:val="0"/>
-                      <w:color w:val="000000"/>
-                      <w:sz w:val="20"/>
-                      <w:szCs w:val="20"/>
-                      <w:u w:val="none"/>
-                      <w:shd w:fill="auto" w:val="clear"/>
-                      <w:vertAlign w:val="baseline"/>
-                    </w:rPr>
-                  </w:pPr>
-                  <w:r>
-                    <w:rPr>
-                      <w:rtl w:val="0"/>
-                    </w:rPr>
-                  </w:r>
-                </w:p>
-              </w:tc>
-            </w:tr>
-            <w:tr>
-              <w:trPr>
-                <w:cantSplit w:val="0"/>
-                <w:tblHeader w:val="0"/>
-              </w:trPr>
-              <w:tc>
-                <w:tcPr>
-                  <w:vAlign w:val="center"/>
-                </w:tcPr>
-                <w:p>
-                  <w:pPr>
-                    <w:keepNext w:val="0"/>
-                    <w:keepLines w:val="0"/>
-                    <w:pageBreakBefore w:val="0"/>
-                    <w:widowControl w:val="1"/>
-                    <w:pBdr>
-                      <w:top w:space="0" w:sz="0" w:val="nil"/>
-                      <w:left w:space="0" w:sz="0" w:val="nil"/>
-                      <w:bottom w:space="0" w:sz="0" w:val="nil"/>
-                      <w:right w:space="0" w:sz="0" w:val="nil"/>
-                      <w:between w:space="0" w:sz="0" w:val="nil"/>
-                    </w:pBdr>
-                    <w:shd w:fill="auto" w:val="clear"/>
-                    <w:spacing w:after="0" w:before="0" w:line="240" w:lineRule="auto"/>
-                    <w:ind w:left="0" w:right="0" w:firstLine="0"/>
-                    <w:jc w:val="left"/>
-                    <w:rPr>
-                      <w:rFonts w:ascii="Arial Narrow" w:cs="Arial Narrow" w:eastAsia="Arial Narrow" w:hAnsi="Arial Narrow"/>
-                      <w:b w:val="0"/>
-                      <w:bCs w:val="0"/>
-                      <w:i w:val="0"/>
-                      <w:iCs w:val="0"/>
-                      <w:smallCaps w:val="0"/>
-                      <w:strike w:val="0"/>
-                      <w:color w:val="000000"/>
-                      <w:sz w:val="20"/>
-                      <w:szCs w:val="20"/>
-                      <w:u w:val="none"/>
-                      <w:shd w:fill="auto" w:val="clear"/>
-                      <w:vertAlign w:val="baseline"/>
-                    </w:rPr>
-                  </w:pPr>
-                  <w:r>
-                    <w:rPr>
-                      <w:rtl w:val="0"/>
-                    </w:rPr>
-                  </w:r>
-                </w:p>
-              </w:tc>
-              <w:tc>
-                <w:tcPr>
-                  <w:vAlign w:val="center"/>
-                </w:tcPr>
-                <w:p>
-                  <w:pPr>
-                    <w:keepNext w:val="0"/>
-                    <w:keepLines w:val="0"/>
-                    <w:pageBreakBefore w:val="0"/>
-                    <w:widowControl w:val="1"/>
-                    <w:pBdr>
-                      <w:top w:space="0" w:sz="0" w:val="nil"/>
-                      <w:left w:space="0" w:sz="0" w:val="nil"/>
-                      <w:bottom w:space="0" w:sz="0" w:val="nil"/>
-                      <w:right w:space="0" w:sz="0" w:val="nil"/>
-                      <w:between w:space="0" w:sz="0" w:val="nil"/>
-                    </w:pBdr>
-                    <w:shd w:fill="auto" w:val="clear"/>
-                    <w:spacing w:after="0" w:before="0" w:line="240" w:lineRule="auto"/>
-                    <w:ind w:left="0" w:right="0" w:firstLine="0"/>
-                    <w:jc w:val="left"/>
-                    <w:rPr>
-                      <w:rFonts w:ascii="Arial Narrow" w:cs="Arial Narrow" w:eastAsia="Arial Narrow" w:hAnsi="Arial Narrow"/>
-                      <w:b w:val="0"/>
-                      <w:bCs w:val="0"/>
-                      <w:i w:val="0"/>
-                      <w:iCs w:val="0"/>
-                      <w:smallCaps w:val="0"/>
-                      <w:strike w:val="0"/>
-                      <w:color w:val="000000"/>
-                      <w:sz w:val="20"/>
-                      <w:szCs w:val="20"/>
-                      <w:u w:val="none"/>
-                      <w:shd w:fill="auto" w:val="clear"/>
-                      <w:vertAlign w:val="baseline"/>
-                    </w:rPr>
-                  </w:pPr>
-                  <w:r>
-                    <w:rPr>
-                      <w:rtl w:val="0"/>
-                    </w:rPr>
-                  </w:r>
-                </w:p>
-              </w:tc>
-              <w:tc>
-                <w:tcPr>
-                  <w:vAlign w:val="center"/>
-                </w:tcPr>
-                <w:p>
-                  <w:pPr>
-                    <w:keepNext w:val="0"/>
-                    <w:keepLines w:val="0"/>
-                    <w:pageBreakBefore w:val="0"/>
-                    <w:widowControl w:val="1"/>
-                    <w:pBdr>
-                      <w:top w:space="0" w:sz="0" w:val="nil"/>
-                      <w:left w:space="0" w:sz="0" w:val="nil"/>
-                      <w:bottom w:space="0" w:sz="0" w:val="nil"/>
-                      <w:right w:space="0" w:sz="0" w:val="nil"/>
-                      <w:between w:space="0" w:sz="0" w:val="nil"/>
-                    </w:pBdr>
-                    <w:shd w:fill="auto" w:val="clear"/>
-                    <w:spacing w:after="0" w:before="0" w:line="240" w:lineRule="auto"/>
-                    <w:ind w:left="0" w:right="0" w:firstLine="0"/>
-                    <w:jc w:val="left"/>
-                    <w:rPr>
-                      <w:rFonts w:ascii="Arial Narrow" w:cs="Arial Narrow" w:eastAsia="Arial Narrow" w:hAnsi="Arial Narrow"/>
-                      <w:b w:val="0"/>
-                      <w:bCs w:val="0"/>
-                      <w:i w:val="0"/>
-                      <w:iCs w:val="0"/>
-                      <w:smallCaps w:val="0"/>
-                      <w:strike w:val="0"/>
-                      <w:color w:val="000000"/>
-                      <w:sz w:val="20"/>
-                      <w:szCs w:val="20"/>
-                      <w:u w:val="none"/>
-                      <w:shd w:fill="auto" w:val="clear"/>
-                      <w:vertAlign w:val="baseline"/>
-                    </w:rPr>
-                  </w:pPr>
-                  <w:r>
-                    <w:rPr>
-                      <w:rtl w:val="0"/>
-                    </w:rPr>
-                  </w:r>
-                </w:p>
-              </w:tc>
-              <w:tc>
-                <w:tcPr>
-                  <w:vAlign w:val="center"/>
-                </w:tcPr>
-                <w:p>
-                  <w:pPr>
-                    <w:keepNext w:val="0"/>
-                    <w:keepLines w:val="0"/>
-                    <w:pageBreakBefore w:val="0"/>
-                    <w:widowControl w:val="1"/>
-                    <w:pBdr>
-                      <w:top w:space="0" w:sz="0" w:val="nil"/>
-                      <w:left w:space="0" w:sz="0" w:val="nil"/>
-                      <w:bottom w:space="0" w:sz="0" w:val="nil"/>
-                      <w:right w:space="0" w:sz="0" w:val="nil"/>
-                      <w:between w:space="0" w:sz="0" w:val="nil"/>
-                    </w:pBdr>
-                    <w:shd w:fill="auto" w:val="clear"/>
-                    <w:spacing w:after="0" w:before="0" w:line="240" w:lineRule="auto"/>
-                    <w:ind w:left="0" w:right="0" w:firstLine="0"/>
-                    <w:jc w:val="left"/>
-                    <w:rPr>
-                      <w:rFonts w:ascii="Arial Narrow" w:cs="Arial Narrow" w:eastAsia="Arial Narrow" w:hAnsi="Arial Narrow"/>
-                      <w:b w:val="0"/>
-                      <w:bCs w:val="0"/>
-                      <w:i w:val="0"/>
-                      <w:iCs w:val="0"/>
-                      <w:smallCaps w:val="0"/>
-                      <w:strike w:val="0"/>
-                      <w:color w:val="000000"/>
-                      <w:sz w:val="20"/>
-                      <w:szCs w:val="20"/>
-                      <w:u w:val="none"/>
-                      <w:shd w:fill="auto" w:val="clear"/>
-                      <w:vertAlign w:val="baseline"/>
-                    </w:rPr>
-                  </w:pPr>
-                  <w:r>
-                    <w:rPr>
-                      <w:rtl w:val="0"/>
-                    </w:rPr>
+                    <w:rPr/>
+                  </w:pPr>
+                  <w:r>
+                    <w:rPr>
+                      <w:rtl w:val="0"/>
+                    </w:rPr>
+                    <w:t xml:space="preserve">-sirca-equipe-D/entregas/  e -sirca-equipe-D/documentos/ciclo-1/ </w:t>
                   </w:r>
                 </w:p>
               </w:tc>
@@ -10883,173 +10407,61 @@
                 </w:tcPr>
                 <w:p>
                   <w:pPr>
-                    <w:keepNext w:val="0"/>
-                    <w:keepLines w:val="0"/>
-                    <w:pageBreakBefore w:val="0"/>
-                    <w:widowControl w:val="1"/>
-                    <w:pBdr>
-                      <w:top w:space="0" w:sz="0" w:val="nil"/>
-                      <w:left w:space="0" w:sz="0" w:val="nil"/>
-                      <w:bottom w:space="0" w:sz="0" w:val="nil"/>
-                      <w:right w:space="0" w:sz="0" w:val="nil"/>
-                      <w:between w:space="0" w:sz="0" w:val="nil"/>
-                    </w:pBdr>
-                    <w:shd w:fill="auto" w:val="clear"/>
-                    <w:spacing w:after="0" w:before="0" w:line="240" w:lineRule="auto"/>
-                    <w:ind w:left="0" w:right="0" w:firstLine="0"/>
-                    <w:jc w:val="left"/>
-                    <w:rPr>
-                      <w:rFonts w:ascii="Arial Narrow" w:cs="Arial Narrow" w:eastAsia="Arial Narrow" w:hAnsi="Arial Narrow"/>
-                      <w:b w:val="0"/>
-                      <w:bCs w:val="0"/>
-                      <w:i w:val="0"/>
-                      <w:iCs w:val="0"/>
-                      <w:smallCaps w:val="0"/>
-                      <w:strike w:val="0"/>
-                      <w:color w:val="000000"/>
-                      <w:sz w:val="20"/>
-                      <w:szCs w:val="20"/>
-                      <w:u w:val="none"/>
-                      <w:shd w:fill="auto" w:val="clear"/>
-                      <w:vertAlign w:val="baseline"/>
-                    </w:rPr>
-                  </w:pPr>
-                  <w:r>
-                    <w:rPr>
-                      <w:rtl w:val="0"/>
-                    </w:rPr>
-                  </w:r>
-                </w:p>
-              </w:tc>
-              <w:tc>
-                <w:tcPr>
-                  <w:vAlign w:val="center"/>
-                </w:tcPr>
-                <w:p>
-                  <w:pPr>
-                    <w:keepNext w:val="0"/>
-                    <w:keepLines w:val="0"/>
-                    <w:pageBreakBefore w:val="0"/>
-                    <w:widowControl w:val="1"/>
-                    <w:pBdr>
-                      <w:top w:space="0" w:sz="0" w:val="nil"/>
-                      <w:left w:space="0" w:sz="0" w:val="nil"/>
-                      <w:bottom w:space="0" w:sz="0" w:val="nil"/>
-                      <w:right w:space="0" w:sz="0" w:val="nil"/>
-                      <w:between w:space="0" w:sz="0" w:val="nil"/>
-                    </w:pBdr>
-                    <w:shd w:fill="auto" w:val="clear"/>
-                    <w:spacing w:after="0" w:before="0" w:line="240" w:lineRule="auto"/>
-                    <w:ind w:left="0" w:right="0" w:firstLine="0"/>
-                    <w:jc w:val="left"/>
-                    <w:rPr>
-                      <w:rFonts w:ascii="Arial Narrow" w:cs="Arial Narrow" w:eastAsia="Arial Narrow" w:hAnsi="Arial Narrow"/>
-                      <w:b w:val="0"/>
-                      <w:bCs w:val="0"/>
-                      <w:i w:val="0"/>
-                      <w:iCs w:val="0"/>
-                      <w:smallCaps w:val="0"/>
-                      <w:strike w:val="0"/>
-                      <w:color w:val="000000"/>
-                      <w:sz w:val="20"/>
-                      <w:szCs w:val="20"/>
-                      <w:u w:val="none"/>
-                      <w:shd w:fill="auto" w:val="clear"/>
-                      <w:vertAlign w:val="baseline"/>
-                    </w:rPr>
-                  </w:pPr>
-                  <w:r>
-                    <w:rPr>
-                      <w:rtl w:val="0"/>
-                    </w:rPr>
-                  </w:r>
-                </w:p>
-              </w:tc>
-              <w:tc>
-                <w:tcPr>
-                  <w:vAlign w:val="center"/>
-                </w:tcPr>
-                <w:p>
-                  <w:pPr>
-                    <w:keepNext w:val="0"/>
-                    <w:keepLines w:val="0"/>
-                    <w:pageBreakBefore w:val="0"/>
-                    <w:widowControl w:val="1"/>
-                    <w:pBdr>
-                      <w:top w:space="0" w:sz="0" w:val="nil"/>
-                      <w:left w:space="0" w:sz="0" w:val="nil"/>
-                      <w:bottom w:space="0" w:sz="0" w:val="nil"/>
-                      <w:right w:space="0" w:sz="0" w:val="nil"/>
-                      <w:between w:space="0" w:sz="0" w:val="nil"/>
-                    </w:pBdr>
-                    <w:shd w:fill="auto" w:val="clear"/>
-                    <w:spacing w:after="0" w:before="0" w:line="240" w:lineRule="auto"/>
-                    <w:ind w:left="0" w:right="0" w:firstLine="0"/>
-                    <w:jc w:val="left"/>
-                    <w:rPr>
-                      <w:rFonts w:ascii="Arial Narrow" w:cs="Arial Narrow" w:eastAsia="Arial Narrow" w:hAnsi="Arial Narrow"/>
-                      <w:b w:val="0"/>
-                      <w:bCs w:val="0"/>
-                      <w:i w:val="0"/>
-                      <w:iCs w:val="0"/>
-                      <w:smallCaps w:val="0"/>
-                      <w:strike w:val="0"/>
-                      <w:color w:val="000000"/>
-                      <w:sz w:val="20"/>
-                      <w:szCs w:val="20"/>
-                      <w:u w:val="none"/>
-                      <w:shd w:fill="auto" w:val="clear"/>
-                      <w:vertAlign w:val="baseline"/>
-                    </w:rPr>
-                  </w:pPr>
-                  <w:r>
-                    <w:rPr>
-                      <w:rtl w:val="0"/>
-                    </w:rPr>
-                  </w:r>
-                </w:p>
-              </w:tc>
-              <w:tc>
-                <w:tcPr>
-                  <w:vAlign w:val="center"/>
-                </w:tcPr>
-                <w:p>
-                  <w:pPr>
-                    <w:keepNext w:val="0"/>
-                    <w:keepLines w:val="0"/>
-                    <w:pageBreakBefore w:val="0"/>
-                    <w:widowControl w:val="1"/>
-                    <w:pBdr>
-                      <w:top w:space="0" w:sz="0" w:val="nil"/>
-                      <w:left w:space="0" w:sz="0" w:val="nil"/>
-                      <w:bottom w:space="0" w:sz="0" w:val="nil"/>
-                      <w:right w:space="0" w:sz="0" w:val="nil"/>
-                      <w:between w:space="0" w:sz="0" w:val="nil"/>
-                    </w:pBdr>
-                    <w:shd w:fill="auto" w:val="clear"/>
-                    <w:spacing w:after="0" w:before="0" w:line="240" w:lineRule="auto"/>
-                    <w:ind w:left="0" w:right="0" w:firstLine="0"/>
-                    <w:jc w:val="left"/>
-                    <w:rPr>
-                      <w:rFonts w:ascii="Arial Narrow" w:cs="Arial Narrow" w:eastAsia="Arial Narrow" w:hAnsi="Arial Narrow"/>
-                      <w:b w:val="0"/>
-                      <w:bCs w:val="0"/>
-                      <w:i w:val="0"/>
-                      <w:iCs w:val="0"/>
-                      <w:smallCaps w:val="0"/>
-                      <w:strike w:val="0"/>
-                      <w:color w:val="000000"/>
-                      <w:sz w:val="20"/>
-                      <w:szCs w:val="20"/>
-                      <w:u w:val="none"/>
-                      <w:shd w:fill="auto" w:val="clear"/>
-                      <w:vertAlign w:val="baseline"/>
-                    </w:rPr>
-                  </w:pPr>
-                  <w:r>
-                    <w:rPr>
-                      <w:rtl w:val="0"/>
-                    </w:rPr>
+                    <w:rPr/>
+                  </w:pPr>
+                  <w:r>
+                    <w:rPr>
+                      <w:rtl w:val="0"/>
+                    </w:rPr>
+                    <w:t xml:space="preserve">Claude</w:t>
+                  </w:r>
+                </w:p>
+              </w:tc>
+              <w:tc>
+                <w:tcPr>
+                  <w:vAlign w:val="center"/>
+                </w:tcPr>
+                <w:p>
+                  <w:pPr>
+                    <w:rPr/>
+                  </w:pPr>
+                  <w:r>
+                    <w:rPr>
+                      <w:rtl w:val="0"/>
+                    </w:rPr>
+                    <w:t xml:space="preserve">Comparação e consistência de informações entre diferentes documentos entregues pela equipe</w:t>
+                  </w:r>
+                </w:p>
+              </w:tc>
+              <w:tc>
+                <w:tcPr>
+                  <w:vAlign w:val="center"/>
+                </w:tcPr>
+                <w:p>
+                  <w:pPr>
+                    <w:rPr/>
+                  </w:pPr>
+                  <w:r>
+                    <w:rPr>
+                      <w:rtl w:val="0"/>
+                    </w:rPr>
+                    <w:t xml:space="preserve">Documento 02 a 07</w:t>
+                  </w:r>
+                </w:p>
+              </w:tc>
+              <w:tc>
+                <w:tcPr>
+                  <w:vAlign w:val="center"/>
+                </w:tcPr>
+                <w:p>
+                  <w:pPr>
+                    <w:rPr/>
+                  </w:pPr>
+                  <w:r>
+                    <w:rPr>
+                      <w:rtl w:val="0"/>
+                    </w:rPr>
+                    <w:t xml:space="preserve">Ciclo 1</w:t>
                   </w:r>
                 </w:p>
               </w:tc>
@@ -11065,173 +10477,61 @@
                 </w:tcPr>
                 <w:p>
                   <w:pPr>
-                    <w:keepNext w:val="0"/>
-                    <w:keepLines w:val="0"/>
-                    <w:pageBreakBefore w:val="0"/>
-                    <w:widowControl w:val="1"/>
-                    <w:pBdr>
-                      <w:top w:space="0" w:sz="0" w:val="nil"/>
-                      <w:left w:space="0" w:sz="0" w:val="nil"/>
-                      <w:bottom w:space="0" w:sz="0" w:val="nil"/>
-                      <w:right w:space="0" w:sz="0" w:val="nil"/>
-                      <w:between w:space="0" w:sz="0" w:val="nil"/>
-                    </w:pBdr>
-                    <w:shd w:fill="auto" w:val="clear"/>
-                    <w:spacing w:after="0" w:before="0" w:line="240" w:lineRule="auto"/>
-                    <w:ind w:left="0" w:right="0" w:firstLine="0"/>
-                    <w:jc w:val="left"/>
-                    <w:rPr>
-                      <w:rFonts w:ascii="Arial Narrow" w:cs="Arial Narrow" w:eastAsia="Arial Narrow" w:hAnsi="Arial Narrow"/>
-                      <w:b w:val="0"/>
-                      <w:bCs w:val="0"/>
-                      <w:i w:val="0"/>
-                      <w:iCs w:val="0"/>
-                      <w:smallCaps w:val="0"/>
-                      <w:strike w:val="0"/>
-                      <w:color w:val="000000"/>
-                      <w:sz w:val="20"/>
-                      <w:szCs w:val="20"/>
-                      <w:u w:val="none"/>
-                      <w:shd w:fill="auto" w:val="clear"/>
-                      <w:vertAlign w:val="baseline"/>
-                    </w:rPr>
-                  </w:pPr>
-                  <w:r>
-                    <w:rPr>
-                      <w:rtl w:val="0"/>
-                    </w:rPr>
-                  </w:r>
-                </w:p>
-              </w:tc>
-              <w:tc>
-                <w:tcPr>
-                  <w:vAlign w:val="center"/>
-                </w:tcPr>
-                <w:p>
-                  <w:pPr>
-                    <w:keepNext w:val="0"/>
-                    <w:keepLines w:val="0"/>
-                    <w:pageBreakBefore w:val="0"/>
-                    <w:widowControl w:val="1"/>
-                    <w:pBdr>
-                      <w:top w:space="0" w:sz="0" w:val="nil"/>
-                      <w:left w:space="0" w:sz="0" w:val="nil"/>
-                      <w:bottom w:space="0" w:sz="0" w:val="nil"/>
-                      <w:right w:space="0" w:sz="0" w:val="nil"/>
-                      <w:between w:space="0" w:sz="0" w:val="nil"/>
-                    </w:pBdr>
-                    <w:shd w:fill="auto" w:val="clear"/>
-                    <w:spacing w:after="0" w:before="0" w:line="240" w:lineRule="auto"/>
-                    <w:ind w:left="0" w:right="0" w:firstLine="0"/>
-                    <w:jc w:val="left"/>
-                    <w:rPr>
-                      <w:rFonts w:ascii="Arial Narrow" w:cs="Arial Narrow" w:eastAsia="Arial Narrow" w:hAnsi="Arial Narrow"/>
-                      <w:b w:val="0"/>
-                      <w:bCs w:val="0"/>
-                      <w:i w:val="0"/>
-                      <w:iCs w:val="0"/>
-                      <w:smallCaps w:val="0"/>
-                      <w:strike w:val="0"/>
-                      <w:color w:val="000000"/>
-                      <w:sz w:val="20"/>
-                      <w:szCs w:val="20"/>
-                      <w:u w:val="none"/>
-                      <w:shd w:fill="auto" w:val="clear"/>
-                      <w:vertAlign w:val="baseline"/>
-                    </w:rPr>
-                  </w:pPr>
-                  <w:r>
-                    <w:rPr>
-                      <w:rtl w:val="0"/>
-                    </w:rPr>
-                  </w:r>
-                </w:p>
-              </w:tc>
-              <w:tc>
-                <w:tcPr>
-                  <w:vAlign w:val="center"/>
-                </w:tcPr>
-                <w:p>
-                  <w:pPr>
-                    <w:keepNext w:val="0"/>
-                    <w:keepLines w:val="0"/>
-                    <w:pageBreakBefore w:val="0"/>
-                    <w:widowControl w:val="1"/>
-                    <w:pBdr>
-                      <w:top w:space="0" w:sz="0" w:val="nil"/>
-                      <w:left w:space="0" w:sz="0" w:val="nil"/>
-                      <w:bottom w:space="0" w:sz="0" w:val="nil"/>
-                      <w:right w:space="0" w:sz="0" w:val="nil"/>
-                      <w:between w:space="0" w:sz="0" w:val="nil"/>
-                    </w:pBdr>
-                    <w:shd w:fill="auto" w:val="clear"/>
-                    <w:spacing w:after="0" w:before="0" w:line="240" w:lineRule="auto"/>
-                    <w:ind w:left="0" w:right="0" w:firstLine="0"/>
-                    <w:jc w:val="left"/>
-                    <w:rPr>
-                      <w:rFonts w:ascii="Arial Narrow" w:cs="Arial Narrow" w:eastAsia="Arial Narrow" w:hAnsi="Arial Narrow"/>
-                      <w:b w:val="0"/>
-                      <w:bCs w:val="0"/>
-                      <w:i w:val="0"/>
-                      <w:iCs w:val="0"/>
-                      <w:smallCaps w:val="0"/>
-                      <w:strike w:val="0"/>
-                      <w:color w:val="000000"/>
-                      <w:sz w:val="20"/>
-                      <w:szCs w:val="20"/>
-                      <w:u w:val="none"/>
-                      <w:shd w:fill="auto" w:val="clear"/>
-                      <w:vertAlign w:val="baseline"/>
-                    </w:rPr>
-                  </w:pPr>
-                  <w:r>
-                    <w:rPr>
-                      <w:rtl w:val="0"/>
-                    </w:rPr>
-                  </w:r>
-                </w:p>
-              </w:tc>
-              <w:tc>
-                <w:tcPr>
-                  <w:vAlign w:val="center"/>
-                </w:tcPr>
-                <w:p>
-                  <w:pPr>
-                    <w:keepNext w:val="0"/>
-                    <w:keepLines w:val="0"/>
-                    <w:pageBreakBefore w:val="0"/>
-                    <w:widowControl w:val="1"/>
-                    <w:pBdr>
-                      <w:top w:space="0" w:sz="0" w:val="nil"/>
-                      <w:left w:space="0" w:sz="0" w:val="nil"/>
-                      <w:bottom w:space="0" w:sz="0" w:val="nil"/>
-                      <w:right w:space="0" w:sz="0" w:val="nil"/>
-                      <w:between w:space="0" w:sz="0" w:val="nil"/>
-                    </w:pBdr>
-                    <w:shd w:fill="auto" w:val="clear"/>
-                    <w:spacing w:after="0" w:before="0" w:line="240" w:lineRule="auto"/>
-                    <w:ind w:left="0" w:right="0" w:firstLine="0"/>
-                    <w:jc w:val="left"/>
-                    <w:rPr>
-                      <w:rFonts w:ascii="Arial Narrow" w:cs="Arial Narrow" w:eastAsia="Arial Narrow" w:hAnsi="Arial Narrow"/>
-                      <w:b w:val="0"/>
-                      <w:bCs w:val="0"/>
-                      <w:i w:val="0"/>
-                      <w:iCs w:val="0"/>
-                      <w:smallCaps w:val="0"/>
-                      <w:strike w:val="0"/>
-                      <w:color w:val="000000"/>
-                      <w:sz w:val="20"/>
-                      <w:szCs w:val="20"/>
-                      <w:u w:val="none"/>
-                      <w:shd w:fill="auto" w:val="clear"/>
-                      <w:vertAlign w:val="baseline"/>
-                    </w:rPr>
-                  </w:pPr>
-                  <w:r>
-                    <w:rPr>
-                      <w:rtl w:val="0"/>
-                    </w:rPr>
+                    <w:rPr/>
+                  </w:pPr>
+                  <w:r>
+                    <w:rPr>
+                      <w:rtl w:val="0"/>
+                    </w:rPr>
+                    <w:t xml:space="preserve">Chat GPT</w:t>
+                  </w:r>
+                </w:p>
+              </w:tc>
+              <w:tc>
+                <w:tcPr>
+                  <w:vAlign w:val="center"/>
+                </w:tcPr>
+                <w:p>
+                  <w:pPr>
+                    <w:rPr/>
+                  </w:pPr>
+                  <w:r>
+                    <w:rPr>
+                      <w:rtl w:val="0"/>
+                    </w:rPr>
+                    <w:t xml:space="preserve">Verificação de coesão entre o glossário, modelo lógico e conceitual</w:t>
+                  </w:r>
+                </w:p>
+              </w:tc>
+              <w:tc>
+                <w:tcPr>
+                  <w:vAlign w:val="center"/>
+                </w:tcPr>
+                <w:p>
+                  <w:pPr>
+                    <w:rPr/>
+                  </w:pPr>
+                  <w:r>
+                    <w:rPr>
+                      <w:rtl w:val="0"/>
+                    </w:rPr>
+                    <w:t xml:space="preserve">Documento 04 e 05</w:t>
+                  </w:r>
+                </w:p>
+              </w:tc>
+              <w:tc>
+                <w:tcPr>
+                  <w:vAlign w:val="center"/>
+                </w:tcPr>
+                <w:p>
+                  <w:pPr>
+                    <w:rPr/>
+                  </w:pPr>
+                  <w:r>
+                    <w:rPr>
+                      <w:rtl w:val="0"/>
+                    </w:rPr>
+                    <w:t xml:space="preserve">Ciclo 1</w:t>
                   </w:r>
                 </w:p>
               </w:tc>
@@ -11247,173 +10547,61 @@
                 </w:tcPr>
                 <w:p>
                   <w:pPr>
-                    <w:keepNext w:val="0"/>
-                    <w:keepLines w:val="0"/>
-                    <w:pageBreakBefore w:val="0"/>
-                    <w:widowControl w:val="1"/>
-                    <w:pBdr>
-                      <w:top w:space="0" w:sz="0" w:val="nil"/>
-                      <w:left w:space="0" w:sz="0" w:val="nil"/>
-                      <w:bottom w:space="0" w:sz="0" w:val="nil"/>
-                      <w:right w:space="0" w:sz="0" w:val="nil"/>
-                      <w:between w:space="0" w:sz="0" w:val="nil"/>
-                    </w:pBdr>
-                    <w:shd w:fill="auto" w:val="clear"/>
-                    <w:spacing w:after="0" w:before="0" w:line="240" w:lineRule="auto"/>
-                    <w:ind w:left="0" w:right="0" w:firstLine="0"/>
-                    <w:jc w:val="left"/>
-                    <w:rPr>
-                      <w:rFonts w:ascii="Arial Narrow" w:cs="Arial Narrow" w:eastAsia="Arial Narrow" w:hAnsi="Arial Narrow"/>
-                      <w:b w:val="0"/>
-                      <w:bCs w:val="0"/>
-                      <w:i w:val="0"/>
-                      <w:iCs w:val="0"/>
-                      <w:smallCaps w:val="0"/>
-                      <w:strike w:val="0"/>
-                      <w:color w:val="000000"/>
-                      <w:sz w:val="20"/>
-                      <w:szCs w:val="20"/>
-                      <w:u w:val="none"/>
-                      <w:shd w:fill="auto" w:val="clear"/>
-                      <w:vertAlign w:val="baseline"/>
-                    </w:rPr>
-                  </w:pPr>
-                  <w:r>
-                    <w:rPr>
-                      <w:rtl w:val="0"/>
-                    </w:rPr>
-                  </w:r>
-                </w:p>
-              </w:tc>
-              <w:tc>
-                <w:tcPr>
-                  <w:vAlign w:val="center"/>
-                </w:tcPr>
-                <w:p>
-                  <w:pPr>
-                    <w:keepNext w:val="0"/>
-                    <w:keepLines w:val="0"/>
-                    <w:pageBreakBefore w:val="0"/>
-                    <w:widowControl w:val="1"/>
-                    <w:pBdr>
-                      <w:top w:space="0" w:sz="0" w:val="nil"/>
-                      <w:left w:space="0" w:sz="0" w:val="nil"/>
-                      <w:bottom w:space="0" w:sz="0" w:val="nil"/>
-                      <w:right w:space="0" w:sz="0" w:val="nil"/>
-                      <w:between w:space="0" w:sz="0" w:val="nil"/>
-                    </w:pBdr>
-                    <w:shd w:fill="auto" w:val="clear"/>
-                    <w:spacing w:after="0" w:before="0" w:line="240" w:lineRule="auto"/>
-                    <w:ind w:left="0" w:right="0" w:firstLine="0"/>
-                    <w:jc w:val="left"/>
-                    <w:rPr>
-                      <w:rFonts w:ascii="Arial Narrow" w:cs="Arial Narrow" w:eastAsia="Arial Narrow" w:hAnsi="Arial Narrow"/>
-                      <w:b w:val="0"/>
-                      <w:bCs w:val="0"/>
-                      <w:i w:val="0"/>
-                      <w:iCs w:val="0"/>
-                      <w:smallCaps w:val="0"/>
-                      <w:strike w:val="0"/>
-                      <w:color w:val="000000"/>
-                      <w:sz w:val="20"/>
-                      <w:szCs w:val="20"/>
-                      <w:u w:val="none"/>
-                      <w:shd w:fill="auto" w:val="clear"/>
-                      <w:vertAlign w:val="baseline"/>
-                    </w:rPr>
-                  </w:pPr>
-                  <w:r>
-                    <w:rPr>
-                      <w:rtl w:val="0"/>
-                    </w:rPr>
-                  </w:r>
-                </w:p>
-              </w:tc>
-              <w:tc>
-                <w:tcPr>
-                  <w:vAlign w:val="center"/>
-                </w:tcPr>
-                <w:p>
-                  <w:pPr>
-                    <w:keepNext w:val="0"/>
-                    <w:keepLines w:val="0"/>
-                    <w:pageBreakBefore w:val="0"/>
-                    <w:widowControl w:val="1"/>
-                    <w:pBdr>
-                      <w:top w:space="0" w:sz="0" w:val="nil"/>
-                      <w:left w:space="0" w:sz="0" w:val="nil"/>
-                      <w:bottom w:space="0" w:sz="0" w:val="nil"/>
-                      <w:right w:space="0" w:sz="0" w:val="nil"/>
-                      <w:between w:space="0" w:sz="0" w:val="nil"/>
-                    </w:pBdr>
-                    <w:shd w:fill="auto" w:val="clear"/>
-                    <w:spacing w:after="0" w:before="0" w:line="240" w:lineRule="auto"/>
-                    <w:ind w:left="0" w:right="0" w:firstLine="0"/>
-                    <w:jc w:val="left"/>
-                    <w:rPr>
-                      <w:rFonts w:ascii="Arial Narrow" w:cs="Arial Narrow" w:eastAsia="Arial Narrow" w:hAnsi="Arial Narrow"/>
-                      <w:b w:val="0"/>
-                      <w:bCs w:val="0"/>
-                      <w:i w:val="0"/>
-                      <w:iCs w:val="0"/>
-                      <w:smallCaps w:val="0"/>
-                      <w:strike w:val="0"/>
-                      <w:color w:val="000000"/>
-                      <w:sz w:val="20"/>
-                      <w:szCs w:val="20"/>
-                      <w:u w:val="none"/>
-                      <w:shd w:fill="auto" w:val="clear"/>
-                      <w:vertAlign w:val="baseline"/>
-                    </w:rPr>
-                  </w:pPr>
-                  <w:r>
-                    <w:rPr>
-                      <w:rtl w:val="0"/>
-                    </w:rPr>
-                  </w:r>
-                </w:p>
-              </w:tc>
-              <w:tc>
-                <w:tcPr>
-                  <w:vAlign w:val="center"/>
-                </w:tcPr>
-                <w:p>
-                  <w:pPr>
-                    <w:keepNext w:val="0"/>
-                    <w:keepLines w:val="0"/>
-                    <w:pageBreakBefore w:val="0"/>
-                    <w:widowControl w:val="1"/>
-                    <w:pBdr>
-                      <w:top w:space="0" w:sz="0" w:val="nil"/>
-                      <w:left w:space="0" w:sz="0" w:val="nil"/>
-                      <w:bottom w:space="0" w:sz="0" w:val="nil"/>
-                      <w:right w:space="0" w:sz="0" w:val="nil"/>
-                      <w:between w:space="0" w:sz="0" w:val="nil"/>
-                    </w:pBdr>
-                    <w:shd w:fill="auto" w:val="clear"/>
-                    <w:spacing w:after="0" w:before="0" w:line="240" w:lineRule="auto"/>
-                    <w:ind w:left="0" w:right="0" w:firstLine="0"/>
-                    <w:jc w:val="left"/>
-                    <w:rPr>
-                      <w:rFonts w:ascii="Arial Narrow" w:cs="Arial Narrow" w:eastAsia="Arial Narrow" w:hAnsi="Arial Narrow"/>
-                      <w:b w:val="0"/>
-                      <w:bCs w:val="0"/>
-                      <w:i w:val="0"/>
-                      <w:iCs w:val="0"/>
-                      <w:smallCaps w:val="0"/>
-                      <w:strike w:val="0"/>
-                      <w:color w:val="000000"/>
-                      <w:sz w:val="20"/>
-                      <w:szCs w:val="20"/>
-                      <w:u w:val="none"/>
-                      <w:shd w:fill="auto" w:val="clear"/>
-                      <w:vertAlign w:val="baseline"/>
-                    </w:rPr>
-                  </w:pPr>
-                  <w:r>
-                    <w:rPr>
-                      <w:rtl w:val="0"/>
-                    </w:rPr>
+                    <w:rPr/>
+                  </w:pPr>
+                  <w:r>
+                    <w:rPr>
+                      <w:rtl w:val="0"/>
+                    </w:rPr>
+                    <w:t xml:space="preserve">Chat GPT</w:t>
+                  </w:r>
+                </w:p>
+              </w:tc>
+              <w:tc>
+                <w:tcPr>
+                  <w:vAlign w:val="center"/>
+                </w:tcPr>
+                <w:p>
+                  <w:pPr>
+                    <w:rPr/>
+                  </w:pPr>
+                  <w:r>
+                    <w:rPr>
+                      <w:rtl w:val="0"/>
+                    </w:rPr>
+                    <w:t xml:space="preserve">Validação de documento para linguagem formal e lógica</w:t>
+                  </w:r>
+                </w:p>
+              </w:tc>
+              <w:tc>
+                <w:tcPr>
+                  <w:vAlign w:val="center"/>
+                </w:tcPr>
+                <w:p>
+                  <w:pPr>
+                    <w:rPr/>
+                  </w:pPr>
+                  <w:r>
+                    <w:rPr>
+                      <w:rtl w:val="0"/>
+                    </w:rPr>
+                    <w:t xml:space="preserve">Documento 02, 03 e 06</w:t>
+                  </w:r>
+                </w:p>
+              </w:tc>
+              <w:tc>
+                <w:tcPr>
+                  <w:vAlign w:val="center"/>
+                </w:tcPr>
+                <w:p>
+                  <w:pPr>
+                    <w:rPr/>
+                  </w:pPr>
+                  <w:r>
+                    <w:rPr>
+                      <w:rtl w:val="0"/>
+                    </w:rPr>
+                    <w:t xml:space="preserve">Ciclo 1</w:t>
                   </w:r>
                 </w:p>
               </w:tc>
@@ -11792,12 +10980,56 @@
       </w:pPr>
       <w:r>
         <w:rPr>
-          <w:rFonts w:ascii="Arial Narrow" w:cs="Arial Narrow" w:eastAsia="Arial Narrow" w:hAnsi="Arial Narrow"/>
-          <w:sz w:val="20"/>
-          <w:szCs w:val="20"/>
           <w:rtl w:val="0"/>
         </w:rPr>
-        <w:t xml:space="preserve">Nome completo e assinatura</w:t>
+        <w:t xml:space="preserve">Ana Laura Almeida de Amorim</w:t>
+      </w:r>
+      <w:r>
+        <w:rPr>
+          <w:rtl w:val="0"/>
+        </w:rPr>
+      </w:r>
+      <w:r>
+        <w:drawing>
+          <wp:anchor allowOverlap="1" behindDoc="1" distB="114300" distT="114300" distL="114300" distR="114300" hidden="0" layoutInCell="1" locked="0" relativeHeight="0" simplePos="0">
+            <wp:simplePos x="0" y="0"/>
+            <wp:positionH relativeFrom="column">
+              <wp:posOffset>95251</wp:posOffset>
+            </wp:positionH>
+            <wp:positionV relativeFrom="paragraph">
+              <wp:posOffset>142875</wp:posOffset>
+            </wp:positionV>
+            <wp:extent cx="6038850" cy="508362"/>
+            <wp:effectExtent b="0" l="0" r="0" t="0"/>
+            <wp:wrapNone/>
+            <wp:docPr id="317" name="image1.jpg"/>
+            <a:graphic>
+              <a:graphicData uri="http://schemas.openxmlformats.org/drawingml/2006/picture">
+                <pic:pic>
+                  <pic:nvPicPr>
+                    <pic:cNvPr id="0" name="image1.jpg"/>
+                    <pic:cNvPicPr preferRelativeResize="0"/>
+                  </pic:nvPicPr>
+                  <pic:blipFill>
+                    <a:blip r:embed="rId7"/>
+                    <a:srcRect b="70382" l="-5678" r="5678" t="14668"/>
+                    <a:stretch>
+                      <a:fillRect/>
+                    </a:stretch>
+                  </pic:blipFill>
+                  <pic:spPr>
+                    <a:xfrm>
+                      <a:off x="0" y="0"/>
+                      <a:ext cx="6038850" cy="508362"/>
+                    </a:xfrm>
+                    <a:prstGeom prst="rect"/>
+                    <a:ln/>
+                  </pic:spPr>
+                </pic:pic>
+              </a:graphicData>
+            </a:graphic>
+          </wp:anchor>
+        </w:drawing>
       </w:r>
     </w:p>
     <w:p>
@@ -11886,12 +11118,56 @@
       </w:pPr>
       <w:r>
         <w:rPr>
-          <w:rFonts w:ascii="Arial Narrow" w:cs="Arial Narrow" w:eastAsia="Arial Narrow" w:hAnsi="Arial Narrow"/>
-          <w:sz w:val="20"/>
-          <w:szCs w:val="20"/>
           <w:rtl w:val="0"/>
         </w:rPr>
-        <w:t xml:space="preserve">Nome completo e assinatura</w:t>
+        <w:t xml:space="preserve">Lucas Goncalves Felix</w:t>
+      </w:r>
+      <w:r>
+        <w:rPr>
+          <w:rtl w:val="0"/>
+        </w:rPr>
+      </w:r>
+      <w:r>
+        <w:drawing>
+          <wp:anchor allowOverlap="1" behindDoc="1" distB="114300" distT="114300" distL="114300" distR="114300" hidden="0" layoutInCell="1" locked="0" relativeHeight="0" simplePos="0">
+            <wp:simplePos x="0" y="0"/>
+            <wp:positionH relativeFrom="column">
+              <wp:posOffset>915995</wp:posOffset>
+            </wp:positionH>
+            <wp:positionV relativeFrom="paragraph">
+              <wp:posOffset>260028</wp:posOffset>
+            </wp:positionV>
+            <wp:extent cx="6038850" cy="504825"/>
+            <wp:effectExtent b="0" l="0" r="0" t="0"/>
+            <wp:wrapNone/>
+            <wp:docPr id="313" name="image1.jpg"/>
+            <a:graphic>
+              <a:graphicData uri="http://schemas.openxmlformats.org/drawingml/2006/picture">
+                <pic:pic>
+                  <pic:nvPicPr>
+                    <pic:cNvPr id="0" name="image1.jpg"/>
+                    <pic:cNvPicPr preferRelativeResize="0"/>
+                  </pic:nvPicPr>
+                  <pic:blipFill>
+                    <a:blip r:embed="rId7"/>
+                    <a:srcRect b="22473" l="1463" r="-17432" t="60190"/>
+                    <a:stretch>
+                      <a:fillRect/>
+                    </a:stretch>
+                  </pic:blipFill>
+                  <pic:spPr>
+                    <a:xfrm>
+                      <a:off x="0" y="0"/>
+                      <a:ext cx="6038850" cy="504825"/>
+                    </a:xfrm>
+                    <a:prstGeom prst="rect"/>
+                    <a:ln/>
+                  </pic:spPr>
+                </pic:pic>
+              </a:graphicData>
+            </a:graphic>
+          </wp:anchor>
+        </w:drawing>
       </w:r>
     </w:p>
     <w:p>
@@ -11980,12 +11256,56 @@
       </w:pPr>
       <w:r>
         <w:rPr>
-          <w:rFonts w:ascii="Arial Narrow" w:cs="Arial Narrow" w:eastAsia="Arial Narrow" w:hAnsi="Arial Narrow"/>
-          <w:sz w:val="20"/>
-          <w:szCs w:val="20"/>
           <w:rtl w:val="0"/>
         </w:rPr>
-        <w:t xml:space="preserve">Nome completo e assinatura</w:t>
+        <w:t xml:space="preserve">Rebeca Oliveira de Castro</w:t>
+      </w:r>
+      <w:r>
+        <w:rPr>
+          <w:rtl w:val="0"/>
+        </w:rPr>
+      </w:r>
+      <w:r>
+        <w:drawing>
+          <wp:anchor allowOverlap="1" behindDoc="1" distB="114300" distT="114300" distL="114300" distR="114300" hidden="0" layoutInCell="1" locked="0" relativeHeight="0" simplePos="0">
+            <wp:simplePos x="0" y="0"/>
+            <wp:positionH relativeFrom="column">
+              <wp:posOffset>559118</wp:posOffset>
+            </wp:positionH>
+            <wp:positionV relativeFrom="paragraph">
+              <wp:posOffset>257175</wp:posOffset>
+            </wp:positionV>
+            <wp:extent cx="5413058" cy="423317"/>
+            <wp:effectExtent b="0" l="0" r="0" t="0"/>
+            <wp:wrapNone/>
+            <wp:docPr id="315" name="image1.jpg"/>
+            <a:graphic>
+              <a:graphicData uri="http://schemas.openxmlformats.org/drawingml/2006/picture">
+                <pic:pic>
+                  <pic:nvPicPr>
+                    <pic:cNvPr id="0" name="image1.jpg"/>
+                    <pic:cNvPicPr preferRelativeResize="0"/>
+                  </pic:nvPicPr>
+                  <pic:blipFill>
+                    <a:blip r:embed="rId7"/>
+                    <a:srcRect b="50842" l="-18895" r="2927" t="32632"/>
+                    <a:stretch>
+                      <a:fillRect/>
+                    </a:stretch>
+                  </pic:blipFill>
+                  <pic:spPr>
+                    <a:xfrm>
+                      <a:off x="0" y="0"/>
+                      <a:ext cx="5413058" cy="423317"/>
+                    </a:xfrm>
+                    <a:prstGeom prst="rect"/>
+                    <a:ln/>
+                  </pic:spPr>
+                </pic:pic>
+              </a:graphicData>
+            </a:graphic>
+          </wp:anchor>
+        </w:drawing>
       </w:r>
     </w:p>
     <w:p>
@@ -12074,12 +11394,56 @@
       </w:pPr>
       <w:r>
         <w:rPr>
-          <w:rFonts w:ascii="Arial Narrow" w:cs="Arial Narrow" w:eastAsia="Arial Narrow" w:hAnsi="Arial Narrow"/>
-          <w:sz w:val="20"/>
-          <w:szCs w:val="20"/>
           <w:rtl w:val="0"/>
         </w:rPr>
-        <w:t xml:space="preserve">Nome completo e assinatura</w:t>
+        <w:t xml:space="preserve">Richter Belmont Pereira Amaral</w:t>
+      </w:r>
+      <w:r>
+        <w:rPr>
+          <w:rtl w:val="0"/>
+        </w:rPr>
+      </w:r>
+      <w:r>
+        <w:drawing>
+          <wp:anchor allowOverlap="1" behindDoc="1" distB="114300" distT="114300" distL="114300" distR="114300" hidden="0" layoutInCell="1" locked="0" relativeHeight="0" simplePos="0">
+            <wp:simplePos x="0" y="0"/>
+            <wp:positionH relativeFrom="column">
+              <wp:posOffset>114300</wp:posOffset>
+            </wp:positionH>
+            <wp:positionV relativeFrom="paragraph">
+              <wp:posOffset>257175</wp:posOffset>
+            </wp:positionV>
+            <wp:extent cx="5559743" cy="457200"/>
+            <wp:effectExtent b="0" l="0" r="0" t="0"/>
+            <wp:wrapNone/>
+            <wp:docPr id="316" name="image1.jpg"/>
+            <a:graphic>
+              <a:graphicData uri="http://schemas.openxmlformats.org/drawingml/2006/picture">
+                <pic:pic>
+                  <pic:nvPicPr>
+                    <pic:cNvPr id="0" name="image1.jpg"/>
+                    <pic:cNvPicPr preferRelativeResize="0"/>
+                  </pic:nvPicPr>
+                  <pic:blipFill>
+                    <a:blip r:embed="rId7"/>
+                    <a:srcRect b="1953" l="-23795" r="7827" t="80119"/>
+                    <a:stretch>
+                      <a:fillRect/>
+                    </a:stretch>
+                  </pic:blipFill>
+                  <pic:spPr>
+                    <a:xfrm>
+                      <a:off x="0" y="0"/>
+                      <a:ext cx="5559743" cy="457200"/>
+                    </a:xfrm>
+                    <a:prstGeom prst="rect"/>
+                    <a:ln/>
+                  </pic:spPr>
+                </pic:pic>
+              </a:graphicData>
+            </a:graphic>
+          </wp:anchor>
+        </w:drawing>
       </w:r>
     </w:p>
     <w:p>
@@ -12112,162 +11476,6 @@
         <w:rPr>
           <w:rtl w:val="0"/>
         </w:rPr>
-      </w:r>
-    </w:p>
-    <w:p>
-      <w:pPr>
-        <w:spacing w:after="120" w:lineRule="auto"/>
-        <w:jc w:val="both"/>
-        <w:rPr>
-          <w:rFonts w:ascii="Arial Narrow" w:cs="Arial Narrow" w:eastAsia="Arial Narrow" w:hAnsi="Arial Narrow"/>
-          <w:sz w:val="20"/>
-          <w:szCs w:val="20"/>
-        </w:rPr>
-      </w:pPr>
-      <w:r>
-        <w:rPr>
-          <w:rtl w:val="0"/>
-        </w:rPr>
-      </w:r>
-    </w:p>
-    <w:p>
-      <w:pPr>
-        <w:jc w:val="center"/>
-        <w:rPr>
-          <w:rFonts w:ascii="Arial Narrow" w:cs="Arial Narrow" w:eastAsia="Arial Narrow" w:hAnsi="Arial Narrow"/>
-          <w:b w:val="1"/>
-          <w:bCs w:val="1"/>
-          <w:sz w:val="20"/>
-          <w:szCs w:val="20"/>
-        </w:rPr>
-      </w:pPr>
-      <w:r>
-        <w:rPr>
-          <w:rFonts w:ascii="Arial Narrow" w:cs="Arial Narrow" w:eastAsia="Arial Narrow" w:hAnsi="Arial Narrow"/>
-          <w:b w:val="1"/>
-          <w:bCs w:val="1"/>
-          <w:sz w:val="20"/>
-          <w:szCs w:val="20"/>
-          <w:rtl w:val="0"/>
-        </w:rPr>
-        <w:t xml:space="preserve">Integrante 5</w:t>
-      </w:r>
-    </w:p>
-    <w:p>
-      <w:pPr>
-        <w:tabs>
-          <w:tab w:val="center" w:leader="none" w:pos="4419"/>
-          <w:tab w:val="right" w:leader="none" w:pos="8838"/>
-        </w:tabs>
-        <w:jc w:val="center"/>
-        <w:rPr>
-          <w:rFonts w:ascii="Arial Narrow" w:cs="Arial Narrow" w:eastAsia="Arial Narrow" w:hAnsi="Arial Narrow"/>
-          <w:sz w:val="20"/>
-          <w:szCs w:val="20"/>
-        </w:rPr>
-      </w:pPr>
-      <w:r>
-        <w:rPr>
-          <w:rFonts w:ascii="Arial Narrow" w:cs="Arial Narrow" w:eastAsia="Arial Narrow" w:hAnsi="Arial Narrow"/>
-          <w:sz w:val="20"/>
-          <w:szCs w:val="20"/>
-          <w:rtl w:val="0"/>
-        </w:rPr>
-        <w:t xml:space="preserve">Nome completo e assinatura</w:t>
-      </w:r>
-    </w:p>
-    <w:p>
-      <w:pPr>
-        <w:spacing w:after="120" w:lineRule="auto"/>
-        <w:jc w:val="both"/>
-        <w:rPr>
-          <w:rFonts w:ascii="Arial Narrow" w:cs="Arial Narrow" w:eastAsia="Arial Narrow" w:hAnsi="Arial Narrow"/>
-          <w:sz w:val="20"/>
-          <w:szCs w:val="20"/>
-        </w:rPr>
-      </w:pPr>
-      <w:r>
-        <w:rPr>
-          <w:rtl w:val="0"/>
-        </w:rPr>
-      </w:r>
-    </w:p>
-    <w:p>
-      <w:pPr>
-        <w:spacing w:after="120" w:lineRule="auto"/>
-        <w:jc w:val="both"/>
-        <w:rPr>
-          <w:rFonts w:ascii="Arial Narrow" w:cs="Arial Narrow" w:eastAsia="Arial Narrow" w:hAnsi="Arial Narrow"/>
-          <w:sz w:val="20"/>
-          <w:szCs w:val="20"/>
-        </w:rPr>
-      </w:pPr>
-      <w:r>
-        <w:rPr>
-          <w:rtl w:val="0"/>
-        </w:rPr>
-      </w:r>
-    </w:p>
-    <w:p>
-      <w:pPr>
-        <w:spacing w:after="120" w:lineRule="auto"/>
-        <w:jc w:val="both"/>
-        <w:rPr>
-          <w:rFonts w:ascii="Arial Narrow" w:cs="Arial Narrow" w:eastAsia="Arial Narrow" w:hAnsi="Arial Narrow"/>
-          <w:sz w:val="20"/>
-          <w:szCs w:val="20"/>
-        </w:rPr>
-      </w:pPr>
-      <w:r>
-        <w:rPr>
-          <w:rtl w:val="0"/>
-        </w:rPr>
-      </w:r>
-    </w:p>
-    <w:p>
-      <w:pPr>
-        <w:jc w:val="center"/>
-        <w:rPr>
-          <w:rFonts w:ascii="Arial Narrow" w:cs="Arial Narrow" w:eastAsia="Arial Narrow" w:hAnsi="Arial Narrow"/>
-          <w:b w:val="1"/>
-          <w:bCs w:val="1"/>
-          <w:sz w:val="20"/>
-          <w:szCs w:val="20"/>
-        </w:rPr>
-      </w:pPr>
-      <w:r>
-        <w:rPr>
-          <w:rFonts w:ascii="Arial Narrow" w:cs="Arial Narrow" w:eastAsia="Arial Narrow" w:hAnsi="Arial Narrow"/>
-          <w:b w:val="1"/>
-          <w:bCs w:val="1"/>
-          <w:sz w:val="20"/>
-          <w:szCs w:val="20"/>
-          <w:rtl w:val="0"/>
-        </w:rPr>
-        <w:t xml:space="preserve">Integrante 6</w:t>
-      </w:r>
-    </w:p>
-    <w:p>
-      <w:pPr>
-        <w:tabs>
-          <w:tab w:val="center" w:leader="none" w:pos="4419"/>
-          <w:tab w:val="right" w:leader="none" w:pos="8838"/>
-        </w:tabs>
-        <w:jc w:val="center"/>
-        <w:rPr>
-          <w:rFonts w:ascii="Arial Narrow" w:cs="Arial Narrow" w:eastAsia="Arial Narrow" w:hAnsi="Arial Narrow"/>
-          <w:sz w:val="20"/>
-          <w:szCs w:val="20"/>
-        </w:rPr>
-      </w:pPr>
-      <w:r>
-        <w:rPr>
-          <w:rFonts w:ascii="Arial Narrow" w:cs="Arial Narrow" w:eastAsia="Arial Narrow" w:hAnsi="Arial Narrow"/>
-          <w:sz w:val="20"/>
-          <w:szCs w:val="20"/>
-          <w:rtl w:val="0"/>
-        </w:rPr>
-        <w:t xml:space="preserve">Nome completo e assinatura</w:t>
       </w:r>
     </w:p>
     <w:p>
@@ -12365,10 +11573,10 @@
       </w:r>
     </w:p>
     <w:sectPr>
-      <w:headerReference r:id="rId7" w:type="default"/>
-      <w:headerReference r:id="rId8" w:type="first"/>
-      <w:footerReference r:id="rId9" w:type="default"/>
-      <w:footerReference r:id="rId10" w:type="first"/>
+      <w:headerReference r:id="rId8" w:type="default"/>
+      <w:headerReference r:id="rId9" w:type="first"/>
+      <w:footerReference r:id="rId10" w:type="default"/>
+      <w:footerReference r:id="rId11" w:type="first"/>
       <w:pgSz w:h="16838" w:w="11906" w:orient="portrait"/>
       <w:pgMar w:bottom="1418" w:top="1559" w:left="567" w:right="566" w:header="709" w:footer="709"/>
       <w:pgNumType w:start="1"/>
@@ -12571,12 +11779,12 @@
               <wp:extent cx="7239645" cy="515620"/>
               <wp:effectExtent b="0" l="0" r="0" t="0"/>
               <wp:wrapNone/>
-              <wp:docPr id="309" name="image5.png"/>
+              <wp:docPr id="309" name="image6.png"/>
               <a:graphic>
                 <a:graphicData uri="http://schemas.openxmlformats.org/drawingml/2006/picture">
                   <pic:pic>
                     <pic:nvPicPr>
-                      <pic:cNvPr id="0" name="image5.png"/>
+                      <pic:cNvPr id="0" name="image6.png"/>
                       <pic:cNvPicPr preferRelativeResize="0"/>
                     </pic:nvPicPr>
                     <pic:blipFill>
@@ -12799,12 +12007,12 @@
               <wp:extent cx="7239635" cy="515620"/>
               <wp:effectExtent b="0" l="0" r="0" t="0"/>
               <wp:wrapNone/>
-              <wp:docPr id="310" name="image6.png"/>
+              <wp:docPr id="310" name="image7.png"/>
               <a:graphic>
                 <a:graphicData uri="http://schemas.openxmlformats.org/drawingml/2006/picture">
                   <pic:pic>
                     <pic:nvPicPr>
-                      <pic:cNvPr id="0" name="image6.png"/>
+                      <pic:cNvPr id="0" name="image7.png"/>
                       <pic:cNvPicPr preferRelativeResize="0"/>
                     </pic:nvPicPr>
                     <pic:blipFill>
@@ -12891,12 +12099,12 @@
           <wp:extent cx="2108930" cy="383843"/>
           <wp:effectExtent b="0" l="0" r="0" t="0"/>
           <wp:wrapNone/>
-          <wp:docPr id="313" name="image2.png"/>
+          <wp:docPr id="314" name="image4.png"/>
           <a:graphic>
             <a:graphicData uri="http://schemas.openxmlformats.org/drawingml/2006/picture">
               <pic:pic>
                 <pic:nvPicPr>
-                  <pic:cNvPr id="0" name="image2.png"/>
+                  <pic:cNvPr id="0" name="image4.png"/>
                   <pic:cNvPicPr preferRelativeResize="0"/>
                 </pic:nvPicPr>
                 <pic:blipFill>
@@ -12976,7 +12184,7 @@
           <wp:extent cx="4472305" cy="3657600"/>
           <wp:effectExtent b="0" l="0" r="0" t="0"/>
           <wp:wrapNone/>
-          <wp:docPr id="316" name="image3.png"/>
+          <wp:docPr id="320" name="image3.png"/>
           <a:graphic>
             <a:graphicData uri="http://schemas.openxmlformats.org/drawingml/2006/picture">
               <pic:pic>
@@ -13123,12 +12331,12 @@
               <wp:extent cx="7642860" cy="1283335"/>
               <wp:effectExtent b="0" l="0" r="0" t="0"/>
               <wp:wrapNone/>
-              <wp:docPr id="308" name="image4.png"/>
+              <wp:docPr id="308" name="image5.png"/>
               <a:graphic>
                 <a:graphicData uri="http://schemas.openxmlformats.org/drawingml/2006/picture">
                   <pic:pic>
                     <pic:nvPicPr>
-                      <pic:cNvPr id="0" name="image4.png"/>
+                      <pic:cNvPr id="0" name="image5.png"/>
                       <pic:cNvPicPr preferRelativeResize="0"/>
                     </pic:nvPicPr>
                     <pic:blipFill>
@@ -13232,12 +12440,12 @@
               <wp:extent cx="3292475" cy="787400"/>
               <wp:effectExtent b="0" l="0" r="0" t="0"/>
               <wp:wrapNone/>
-              <wp:docPr id="312" name="image8.png"/>
+              <wp:docPr id="312" name="image9.png"/>
               <a:graphic>
                 <a:graphicData uri="http://schemas.openxmlformats.org/drawingml/2006/picture">
                   <pic:pic>
                     <pic:nvPicPr>
-                      <pic:cNvPr id="0" name="image8.png"/>
+                      <pic:cNvPr id="0" name="image9.png"/>
                       <pic:cNvPicPr preferRelativeResize="0"/>
                     </pic:nvPicPr>
                     <pic:blipFill>
@@ -13377,12 +12585,12 @@
               <wp:extent cx="3286760" cy="809625"/>
               <wp:effectExtent b="0" l="0" r="0" t="0"/>
               <wp:wrapNone/>
-              <wp:docPr id="311" name="image7.png"/>
+              <wp:docPr id="311" name="image8.png"/>
               <a:graphic>
                 <a:graphicData uri="http://schemas.openxmlformats.org/drawingml/2006/picture">
                   <pic:pic>
                     <pic:nvPicPr>
-                      <pic:cNvPr id="0" name="image7.png"/>
+                      <pic:cNvPr id="0" name="image8.png"/>
                       <pic:cNvPicPr preferRelativeResize="0"/>
                     </pic:nvPicPr>
                     <pic:blipFill>
@@ -13421,12 +12629,12 @@
           <wp:extent cx="2933700" cy="506730"/>
           <wp:effectExtent b="0" l="0" r="0" t="0"/>
           <wp:wrapNone/>
-          <wp:docPr descr="Placa azul com letras brancas em fundo preto&#10;&#10;Descrição gerada automaticamente com confiança média" id="315" name="image1.png"/>
+          <wp:docPr descr="Placa azul com letras brancas em fundo preto&#10;&#10;Descrição gerada automaticamente com confiança média" id="319" name="image2.png"/>
           <a:graphic>
             <a:graphicData uri="http://schemas.openxmlformats.org/drawingml/2006/picture">
               <pic:pic>
                 <pic:nvPicPr>
-                  <pic:cNvPr descr="Placa azul com letras brancas em fundo preto&#10;&#10;Descrição gerada automaticamente com confiança média" id="0" name="image1.png"/>
+                  <pic:cNvPr descr="Placa azul com letras brancas em fundo preto&#10;&#10;Descrição gerada automaticamente com confiança média" id="0" name="image2.png"/>
                   <pic:cNvPicPr preferRelativeResize="0"/>
                 </pic:nvPicPr>
                 <pic:blipFill>
@@ -13588,7 +12796,7 @@
           <wp:extent cx="4472305" cy="3657600"/>
           <wp:effectExtent b="0" l="0" r="0" t="0"/>
           <wp:wrapNone/>
-          <wp:docPr id="314" name="image3.png"/>
+          <wp:docPr id="318" name="image3.png"/>
           <a:graphic>
             <a:graphicData uri="http://schemas.openxmlformats.org/drawingml/2006/picture">
               <pic:pic>

</xml_diff>